<commit_message>
Update cashback handling and product listings
Co-authored-by: Copilot <223556219+Copilot@users.noreply.github.com>
</commit_message>
<xml_diff>
--- a/Fourstep file change after new plan so fille name and new file name.docx
+++ b/Fourstep file change after new plan so fille name and new file name.docx
@@ -11958,24 +11958,435 @@
     </w:p>
     <w:p>
       <w:pPr>
-        <w:pStyle w:val="ListParagraph"/>
-        <w:rPr>
-          <w:b/>
-          <w:color w:val="000000" w:themeColor="text1"/>
-          <w:lang w:val="en-US"/>
-        </w:rPr>
-      </w:pPr>
-    </w:p>
-    <w:p>
-      <w:pPr>
-        <w:rPr>
-          <w:b/>
-          <w:color w:val="FF0000"/>
-          <w:lang w:val="en-US"/>
-        </w:rPr>
-      </w:pPr>
+        <w:rPr>
+          <w:b/>
+          <w:color w:val="000000" w:themeColor="text1"/>
+          <w:sz w:val="24"/>
+          <w:szCs w:val="24"/>
+          <w:highlight w:val="yellow"/>
+          <w:lang w:val="en-US"/>
+        </w:rPr>
+      </w:pPr>
+    </w:p>
+    <w:p>
+      <w:pPr>
+        <w:pStyle w:val="ListParagraph"/>
+        <w:ind w:left="1440"/>
+        <w:jc w:val="center"/>
+        <w:rPr>
+          <w:rFonts w:ascii="Times New Roman" w:hAnsi="Times New Roman" w:cs="Times New Roman"/>
+          <w:b/>
+          <w:color w:val="000000" w:themeColor="text1"/>
+          <w:sz w:val="32"/>
+          <w:szCs w:val="32"/>
+          <w:lang w:val="en-US"/>
+        </w:rPr>
+      </w:pPr>
+      <w:r>
+        <w:rPr>
+          <w:rFonts w:ascii="Times New Roman" w:hAnsi="Times New Roman" w:cs="Times New Roman"/>
+          <w:b/>
+          <w:color w:val="000000" w:themeColor="text1"/>
+          <w:sz w:val="32"/>
+          <w:szCs w:val="32"/>
+          <w:lang w:val="en-US"/>
+        </w:rPr>
+        <w:t xml:space="preserve">Today File </w:t>
+      </w:r>
+      <w:r>
+        <w:rPr>
+          <w:rFonts w:ascii="Times New Roman" w:hAnsi="Times New Roman" w:cs="Times New Roman"/>
+          <w:b/>
+          <w:color w:val="000000" w:themeColor="text1"/>
+          <w:sz w:val="32"/>
+          <w:szCs w:val="32"/>
+          <w:lang w:val="en-US"/>
+        </w:rPr>
+        <w:t>Change (21</w:t>
+      </w:r>
+      <w:r>
+        <w:rPr>
+          <w:rFonts w:ascii="Times New Roman" w:hAnsi="Times New Roman" w:cs="Times New Roman"/>
+          <w:b/>
+          <w:color w:val="000000" w:themeColor="text1"/>
+          <w:sz w:val="32"/>
+          <w:szCs w:val="32"/>
+          <w:lang w:val="en-US"/>
+        </w:rPr>
+        <w:t>/09)</w:t>
+      </w:r>
+    </w:p>
+    <w:p>
+      <w:pPr>
+        <w:pStyle w:val="ListParagraph"/>
+        <w:ind w:left="1440"/>
+        <w:jc w:val="center"/>
+        <w:rPr>
+          <w:rFonts w:ascii="Times New Roman" w:hAnsi="Times New Roman" w:cs="Times New Roman"/>
+          <w:b/>
+          <w:color w:val="000000" w:themeColor="text1"/>
+          <w:sz w:val="32"/>
+          <w:szCs w:val="32"/>
+          <w:lang w:val="en-US"/>
+        </w:rPr>
+      </w:pPr>
+    </w:p>
+    <w:p>
+      <w:pPr>
+        <w:pStyle w:val="ListParagraph"/>
+        <w:numPr>
+          <w:ilvl w:val="0"/>
+          <w:numId w:val="20"/>
+        </w:numPr>
+        <w:ind w:left="851"/>
+        <w:rPr>
+          <w:rFonts w:ascii="Times New Roman" w:hAnsi="Times New Roman" w:cs="Times New Roman"/>
+          <w:b/>
+          <w:color w:val="000000" w:themeColor="text1"/>
+          <w:sz w:val="28"/>
+          <w:szCs w:val="28"/>
+          <w:lang w:val="en-US"/>
+        </w:rPr>
+      </w:pPr>
+      <w:r>
+        <w:rPr>
+          <w:rFonts w:ascii="Times New Roman" w:hAnsi="Times New Roman" w:cs="Times New Roman"/>
+          <w:b/>
+          <w:color w:val="000000" w:themeColor="text1"/>
+          <w:sz w:val="28"/>
+          <w:szCs w:val="28"/>
+          <w:lang w:val="en-US"/>
+        </w:rPr>
+        <w:t xml:space="preserve">Cashback </w:t>
+      </w:r>
+      <w:proofErr w:type="spellStart"/>
+      <w:r>
+        <w:rPr>
+          <w:rFonts w:ascii="Times New Roman" w:hAnsi="Times New Roman" w:cs="Times New Roman"/>
+          <w:b/>
+          <w:color w:val="000000" w:themeColor="text1"/>
+          <w:sz w:val="28"/>
+          <w:szCs w:val="28"/>
+          <w:lang w:val="en-US"/>
+        </w:rPr>
+        <w:t>lodic</w:t>
+      </w:r>
+      <w:proofErr w:type="spellEnd"/>
+      <w:r>
+        <w:rPr>
+          <w:rFonts w:ascii="Times New Roman" w:hAnsi="Times New Roman" w:cs="Times New Roman"/>
+          <w:b/>
+          <w:color w:val="000000" w:themeColor="text1"/>
+          <w:sz w:val="28"/>
+          <w:szCs w:val="28"/>
+          <w:lang w:val="en-US"/>
+        </w:rPr>
+        <w:t xml:space="preserve"> change (% to Rupee )</w:t>
+      </w:r>
+    </w:p>
+    <w:p>
+      <w:pPr>
+        <w:pStyle w:val="ListParagraph"/>
+        <w:numPr>
+          <w:ilvl w:val="0"/>
+          <w:numId w:val="21"/>
+        </w:numPr>
+        <w:rPr>
+          <w:rFonts w:ascii="Times New Roman" w:hAnsi="Times New Roman" w:cs="Times New Roman"/>
+          <w:b/>
+          <w:color w:val="000000" w:themeColor="text1"/>
+          <w:sz w:val="24"/>
+          <w:szCs w:val="24"/>
+          <w:lang w:val="en-US"/>
+        </w:rPr>
+      </w:pPr>
+      <w:r>
+        <w:rPr>
+          <w:rFonts w:ascii="Times New Roman" w:hAnsi="Times New Roman" w:cs="Times New Roman"/>
+          <w:b/>
+          <w:color w:val="000000" w:themeColor="text1"/>
+          <w:sz w:val="24"/>
+          <w:szCs w:val="24"/>
+          <w:lang w:val="en-US"/>
+        </w:rPr>
+        <w:t xml:space="preserve">Modify </w:t>
+      </w:r>
+      <w:proofErr w:type="spellStart"/>
+      <w:r>
+        <w:rPr>
+          <w:rFonts w:ascii="Times New Roman" w:hAnsi="Times New Roman" w:cs="Times New Roman"/>
+          <w:b/>
+          <w:color w:val="000000" w:themeColor="text1"/>
+          <w:sz w:val="24"/>
+          <w:szCs w:val="24"/>
+          <w:lang w:val="en-US"/>
+        </w:rPr>
+        <w:t>laravel_backend</w:t>
+      </w:r>
+      <w:proofErr w:type="spellEnd"/>
+      <w:r>
+        <w:rPr>
+          <w:rFonts w:ascii="Times New Roman" w:hAnsi="Times New Roman" w:cs="Times New Roman"/>
+          <w:b/>
+          <w:color w:val="000000" w:themeColor="text1"/>
+          <w:sz w:val="24"/>
+          <w:szCs w:val="24"/>
+          <w:lang w:val="en-US"/>
+        </w:rPr>
+        <w:t>\app\Http\Controllers\</w:t>
+      </w:r>
+      <w:proofErr w:type="spellStart"/>
+      <w:r>
+        <w:rPr>
+          <w:rFonts w:ascii="Times New Roman" w:hAnsi="Times New Roman" w:cs="Times New Roman"/>
+          <w:b/>
+          <w:color w:val="000000" w:themeColor="text1"/>
+          <w:sz w:val="24"/>
+          <w:szCs w:val="24"/>
+          <w:lang w:val="en-US"/>
+        </w:rPr>
+        <w:t>api</w:t>
+      </w:r>
+      <w:proofErr w:type="spellEnd"/>
+      <w:r>
+        <w:rPr>
+          <w:rFonts w:ascii="Times New Roman" w:hAnsi="Times New Roman" w:cs="Times New Roman"/>
+          <w:b/>
+          <w:color w:val="000000" w:themeColor="text1"/>
+          <w:sz w:val="24"/>
+          <w:szCs w:val="24"/>
+          <w:lang w:val="en-US"/>
+        </w:rPr>
+        <w:t>\</w:t>
+      </w:r>
+      <w:proofErr w:type="spellStart"/>
+      <w:r>
+        <w:rPr>
+          <w:rFonts w:ascii="Times New Roman" w:hAnsi="Times New Roman" w:cs="Times New Roman"/>
+          <w:b/>
+          <w:color w:val="000000" w:themeColor="text1"/>
+          <w:sz w:val="24"/>
+          <w:szCs w:val="24"/>
+          <w:lang w:val="en-US"/>
+        </w:rPr>
+        <w:t>OrderController.php</w:t>
+      </w:r>
+      <w:proofErr w:type="spellEnd"/>
+    </w:p>
+    <w:p>
+      <w:pPr>
+        <w:pStyle w:val="ListParagraph"/>
+        <w:numPr>
+          <w:ilvl w:val="0"/>
+          <w:numId w:val="21"/>
+        </w:numPr>
+        <w:rPr>
+          <w:rFonts w:ascii="Times New Roman" w:hAnsi="Times New Roman" w:cs="Times New Roman"/>
+          <w:b/>
+          <w:color w:val="000000" w:themeColor="text1"/>
+          <w:sz w:val="24"/>
+          <w:szCs w:val="24"/>
+          <w:lang w:val="en-US"/>
+        </w:rPr>
+      </w:pPr>
+      <w:r>
+        <w:rPr>
+          <w:rFonts w:ascii="Times New Roman" w:hAnsi="Times New Roman" w:cs="Times New Roman"/>
+          <w:b/>
+          <w:color w:val="000000" w:themeColor="text1"/>
+          <w:sz w:val="24"/>
+          <w:szCs w:val="24"/>
+          <w:lang w:val="en-US"/>
+        </w:rPr>
+        <w:t>Modify laravel_backend\app\Filament\Resources\Productecoms\Schemas\ProductecomForm.php</w:t>
+      </w:r>
+    </w:p>
+    <w:p>
+      <w:pPr>
+        <w:pStyle w:val="ListParagraph"/>
+        <w:numPr>
+          <w:ilvl w:val="0"/>
+          <w:numId w:val="21"/>
+        </w:numPr>
+        <w:rPr>
+          <w:rFonts w:ascii="Times New Roman" w:hAnsi="Times New Roman" w:cs="Times New Roman"/>
+          <w:b/>
+          <w:color w:val="000000" w:themeColor="text1"/>
+          <w:sz w:val="24"/>
+          <w:szCs w:val="24"/>
+          <w:lang w:val="en-US"/>
+        </w:rPr>
+      </w:pPr>
+      <w:r>
+        <w:rPr>
+          <w:rFonts w:ascii="Times New Roman" w:hAnsi="Times New Roman" w:cs="Times New Roman"/>
+          <w:b/>
+          <w:color w:val="000000" w:themeColor="text1"/>
+          <w:sz w:val="24"/>
+          <w:szCs w:val="24"/>
+          <w:lang w:val="en-US"/>
+        </w:rPr>
+        <w:t xml:space="preserve">Modify </w:t>
+      </w:r>
+      <w:r>
+        <w:rPr>
+          <w:rFonts w:ascii="Times New Roman" w:hAnsi="Times New Roman" w:cs="Times New Roman"/>
+          <w:b/>
+          <w:color w:val="000000" w:themeColor="text1"/>
+          <w:sz w:val="24"/>
+          <w:szCs w:val="24"/>
+          <w:lang w:val="en-US"/>
+        </w:rPr>
+        <w:t>laravel_backend\resources\views\filament\pages\product-view.blade.php</w:t>
+      </w:r>
+    </w:p>
+    <w:p>
+      <w:pPr>
+        <w:pStyle w:val="ListParagraph"/>
+        <w:numPr>
+          <w:ilvl w:val="0"/>
+          <w:numId w:val="21"/>
+        </w:numPr>
+        <w:rPr>
+          <w:rFonts w:ascii="Times New Roman" w:hAnsi="Times New Roman" w:cs="Times New Roman"/>
+          <w:b/>
+          <w:color w:val="000000" w:themeColor="text1"/>
+          <w:sz w:val="24"/>
+          <w:szCs w:val="24"/>
+          <w:lang w:val="en-US"/>
+        </w:rPr>
+      </w:pPr>
+      <w:r>
+        <w:rPr>
+          <w:rFonts w:ascii="Times New Roman" w:hAnsi="Times New Roman" w:cs="Times New Roman"/>
+          <w:b/>
+          <w:color w:val="000000" w:themeColor="text1"/>
+          <w:sz w:val="24"/>
+          <w:szCs w:val="24"/>
+          <w:lang w:val="en-US"/>
+        </w:rPr>
+        <w:t xml:space="preserve">Modify </w:t>
+      </w:r>
+      <w:r>
+        <w:rPr>
+          <w:rFonts w:ascii="Times New Roman" w:hAnsi="Times New Roman" w:cs="Times New Roman"/>
+          <w:b/>
+          <w:color w:val="000000" w:themeColor="text1"/>
+          <w:sz w:val="24"/>
+          <w:szCs w:val="24"/>
+          <w:lang w:val="en-US"/>
+        </w:rPr>
+        <w:t>frontend\</w:t>
+      </w:r>
+      <w:proofErr w:type="spellStart"/>
+      <w:r>
+        <w:rPr>
+          <w:rFonts w:ascii="Times New Roman" w:hAnsi="Times New Roman" w:cs="Times New Roman"/>
+          <w:b/>
+          <w:color w:val="000000" w:themeColor="text1"/>
+          <w:sz w:val="24"/>
+          <w:szCs w:val="24"/>
+          <w:lang w:val="en-US"/>
+        </w:rPr>
+        <w:t>src</w:t>
+      </w:r>
+      <w:proofErr w:type="spellEnd"/>
+      <w:r>
+        <w:rPr>
+          <w:rFonts w:ascii="Times New Roman" w:hAnsi="Times New Roman" w:cs="Times New Roman"/>
+          <w:b/>
+          <w:color w:val="000000" w:themeColor="text1"/>
+          <w:sz w:val="24"/>
+          <w:szCs w:val="24"/>
+          <w:lang w:val="en-US"/>
+        </w:rPr>
+        <w:t>\modules\member\pages\</w:t>
+      </w:r>
+      <w:proofErr w:type="spellStart"/>
+      <w:r>
+        <w:rPr>
+          <w:rFonts w:ascii="Times New Roman" w:hAnsi="Times New Roman" w:cs="Times New Roman"/>
+          <w:b/>
+          <w:color w:val="000000" w:themeColor="text1"/>
+          <w:sz w:val="24"/>
+          <w:szCs w:val="24"/>
+          <w:lang w:val="en-US"/>
+        </w:rPr>
+        <w:t>BVProductList.jsx</w:t>
+      </w:r>
+      <w:proofErr w:type="spellEnd"/>
+    </w:p>
+    <w:p>
+      <w:pPr>
+        <w:pStyle w:val="ListParagraph"/>
+        <w:numPr>
+          <w:ilvl w:val="0"/>
+          <w:numId w:val="21"/>
+        </w:numPr>
+        <w:rPr>
+          <w:rFonts w:ascii="Times New Roman" w:hAnsi="Times New Roman" w:cs="Times New Roman"/>
+          <w:b/>
+          <w:color w:val="000000" w:themeColor="text1"/>
+          <w:sz w:val="24"/>
+          <w:szCs w:val="24"/>
+          <w:lang w:val="en-US"/>
+        </w:rPr>
+      </w:pPr>
+      <w:r>
+        <w:rPr>
+          <w:rFonts w:ascii="Times New Roman" w:hAnsi="Times New Roman" w:cs="Times New Roman"/>
+          <w:b/>
+          <w:color w:val="000000" w:themeColor="text1"/>
+          <w:sz w:val="24"/>
+          <w:szCs w:val="24"/>
+          <w:lang w:val="en-US"/>
+        </w:rPr>
+        <w:t xml:space="preserve">Modify </w:t>
+      </w:r>
+      <w:r>
+        <w:rPr>
+          <w:rFonts w:ascii="Times New Roman" w:hAnsi="Times New Roman" w:cs="Times New Roman"/>
+          <w:b/>
+          <w:color w:val="000000" w:themeColor="text1"/>
+          <w:sz w:val="24"/>
+          <w:szCs w:val="24"/>
+          <w:lang w:val="en-US"/>
+        </w:rPr>
+        <w:t>frontend\src\modules\shoppee\pages\BVProductList.jsx</w:t>
+      </w:r>
       <w:bookmarkStart w:id="0" w:name="_GoBack"/>
       <w:bookmarkEnd w:id="0"/>
+    </w:p>
+    <w:p>
+      <w:pPr>
+        <w:rPr>
+          <w:b/>
+          <w:color w:val="000000" w:themeColor="text1"/>
+          <w:sz w:val="24"/>
+          <w:szCs w:val="24"/>
+          <w:highlight w:val="yellow"/>
+          <w:lang w:val="en-US"/>
+        </w:rPr>
+      </w:pPr>
+    </w:p>
+    <w:p>
+      <w:pPr>
+        <w:pStyle w:val="ListParagraph"/>
+        <w:rPr>
+          <w:b/>
+          <w:color w:val="000000" w:themeColor="text1"/>
+          <w:lang w:val="en-US"/>
+        </w:rPr>
+      </w:pPr>
+    </w:p>
+    <w:p>
+      <w:pPr>
+        <w:rPr>
+          <w:b/>
+          <w:color w:val="FF0000"/>
+          <w:lang w:val="en-US"/>
+        </w:rPr>
+      </w:pPr>
     </w:p>
     <w:p>
       <w:pPr>
@@ -12718,6 +13129,119 @@
     </w:lvl>
   </w:abstractNum>
   <w:abstractNum w:abstractNumId="8">
+    <w:nsid w:val="3953544F"/>
+    <w:multiLevelType w:val="hybridMultilevel"/>
+    <w:tmpl w:val="5C941C4A"/>
+    <w:lvl w:ilvl="0" w:tplc="40090001">
+      <w:start w:val="1"/>
+      <w:numFmt w:val="bullet"/>
+      <w:lvlText w:val=""/>
+      <w:lvlJc w:val="left"/>
+      <w:pPr>
+        <w:ind w:left="2160" w:hanging="360"/>
+      </w:pPr>
+      <w:rPr>
+        <w:rFonts w:ascii="Symbol" w:hAnsi="Symbol" w:hint="default"/>
+      </w:rPr>
+    </w:lvl>
+    <w:lvl w:ilvl="1" w:tplc="40090003" w:tentative="1">
+      <w:start w:val="1"/>
+      <w:numFmt w:val="bullet"/>
+      <w:lvlText w:val="o"/>
+      <w:lvlJc w:val="left"/>
+      <w:pPr>
+        <w:ind w:left="2880" w:hanging="360"/>
+      </w:pPr>
+      <w:rPr>
+        <w:rFonts w:ascii="Courier New" w:hAnsi="Courier New" w:cs="Courier New" w:hint="default"/>
+      </w:rPr>
+    </w:lvl>
+    <w:lvl w:ilvl="2" w:tplc="40090005" w:tentative="1">
+      <w:start w:val="1"/>
+      <w:numFmt w:val="bullet"/>
+      <w:lvlText w:val=""/>
+      <w:lvlJc w:val="left"/>
+      <w:pPr>
+        <w:ind w:left="3600" w:hanging="360"/>
+      </w:pPr>
+      <w:rPr>
+        <w:rFonts w:ascii="Wingdings" w:hAnsi="Wingdings" w:hint="default"/>
+      </w:rPr>
+    </w:lvl>
+    <w:lvl w:ilvl="3" w:tplc="40090001" w:tentative="1">
+      <w:start w:val="1"/>
+      <w:numFmt w:val="bullet"/>
+      <w:lvlText w:val=""/>
+      <w:lvlJc w:val="left"/>
+      <w:pPr>
+        <w:ind w:left="4320" w:hanging="360"/>
+      </w:pPr>
+      <w:rPr>
+        <w:rFonts w:ascii="Symbol" w:hAnsi="Symbol" w:hint="default"/>
+      </w:rPr>
+    </w:lvl>
+    <w:lvl w:ilvl="4" w:tplc="40090003" w:tentative="1">
+      <w:start w:val="1"/>
+      <w:numFmt w:val="bullet"/>
+      <w:lvlText w:val="o"/>
+      <w:lvlJc w:val="left"/>
+      <w:pPr>
+        <w:ind w:left="5040" w:hanging="360"/>
+      </w:pPr>
+      <w:rPr>
+        <w:rFonts w:ascii="Courier New" w:hAnsi="Courier New" w:cs="Courier New" w:hint="default"/>
+      </w:rPr>
+    </w:lvl>
+    <w:lvl w:ilvl="5" w:tplc="40090005" w:tentative="1">
+      <w:start w:val="1"/>
+      <w:numFmt w:val="bullet"/>
+      <w:lvlText w:val=""/>
+      <w:lvlJc w:val="left"/>
+      <w:pPr>
+        <w:ind w:left="5760" w:hanging="360"/>
+      </w:pPr>
+      <w:rPr>
+        <w:rFonts w:ascii="Wingdings" w:hAnsi="Wingdings" w:hint="default"/>
+      </w:rPr>
+    </w:lvl>
+    <w:lvl w:ilvl="6" w:tplc="40090001" w:tentative="1">
+      <w:start w:val="1"/>
+      <w:numFmt w:val="bullet"/>
+      <w:lvlText w:val=""/>
+      <w:lvlJc w:val="left"/>
+      <w:pPr>
+        <w:ind w:left="6480" w:hanging="360"/>
+      </w:pPr>
+      <w:rPr>
+        <w:rFonts w:ascii="Symbol" w:hAnsi="Symbol" w:hint="default"/>
+      </w:rPr>
+    </w:lvl>
+    <w:lvl w:ilvl="7" w:tplc="40090003" w:tentative="1">
+      <w:start w:val="1"/>
+      <w:numFmt w:val="bullet"/>
+      <w:lvlText w:val="o"/>
+      <w:lvlJc w:val="left"/>
+      <w:pPr>
+        <w:ind w:left="7200" w:hanging="360"/>
+      </w:pPr>
+      <w:rPr>
+        <w:rFonts w:ascii="Courier New" w:hAnsi="Courier New" w:cs="Courier New" w:hint="default"/>
+      </w:rPr>
+    </w:lvl>
+    <w:lvl w:ilvl="8" w:tplc="40090005" w:tentative="1">
+      <w:start w:val="1"/>
+      <w:numFmt w:val="bullet"/>
+      <w:lvlText w:val=""/>
+      <w:lvlJc w:val="left"/>
+      <w:pPr>
+        <w:ind w:left="7920" w:hanging="360"/>
+      </w:pPr>
+      <w:rPr>
+        <w:rFonts w:ascii="Wingdings" w:hAnsi="Wingdings" w:hint="default"/>
+      </w:rPr>
+    </w:lvl>
+  </w:abstractNum>
+  <w:abstractNum w:abstractNumId="9">
     <w:nsid w:val="3AD0713C"/>
     <w:multiLevelType w:val="hybridMultilevel"/>
     <w:tmpl w:val="C79E981C"/>
@@ -12803,7 +13327,7 @@
       </w:pPr>
     </w:lvl>
   </w:abstractNum>
-  <w:abstractNum w:abstractNumId="9">
+  <w:abstractNum w:abstractNumId="10">
     <w:nsid w:val="3EF16BAC"/>
     <w:multiLevelType w:val="hybridMultilevel"/>
     <w:tmpl w:val="C376FDAC"/>
@@ -12889,7 +13413,7 @@
       </w:pPr>
     </w:lvl>
   </w:abstractNum>
-  <w:abstractNum w:abstractNumId="10">
+  <w:abstractNum w:abstractNumId="11">
     <w:nsid w:val="3F166930"/>
     <w:multiLevelType w:val="hybridMultilevel"/>
     <w:tmpl w:val="32CE91E4"/>
@@ -12975,7 +13499,7 @@
       </w:pPr>
     </w:lvl>
   </w:abstractNum>
-  <w:abstractNum w:abstractNumId="11">
+  <w:abstractNum w:abstractNumId="12">
     <w:nsid w:val="47B10B47"/>
     <w:multiLevelType w:val="hybridMultilevel"/>
     <w:tmpl w:val="B85ADAD2"/>
@@ -13061,7 +13585,7 @@
       </w:pPr>
     </w:lvl>
   </w:abstractNum>
-  <w:abstractNum w:abstractNumId="12">
+  <w:abstractNum w:abstractNumId="13">
     <w:nsid w:val="4CD017F4"/>
     <w:multiLevelType w:val="hybridMultilevel"/>
     <w:tmpl w:val="A5624F7C"/>
@@ -13147,7 +13671,7 @@
       </w:pPr>
     </w:lvl>
   </w:abstractNum>
-  <w:abstractNum w:abstractNumId="13">
+  <w:abstractNum w:abstractNumId="14">
     <w:nsid w:val="4D1614F3"/>
     <w:multiLevelType w:val="hybridMultilevel"/>
     <w:tmpl w:val="E2346CE8"/>
@@ -13260,7 +13784,7 @@
       </w:rPr>
     </w:lvl>
   </w:abstractNum>
-  <w:abstractNum w:abstractNumId="14">
+  <w:abstractNum w:abstractNumId="15">
     <w:nsid w:val="532D2A1B"/>
     <w:multiLevelType w:val="hybridMultilevel"/>
     <w:tmpl w:val="249E3E26"/>
@@ -13346,7 +13870,7 @@
       </w:pPr>
     </w:lvl>
   </w:abstractNum>
-  <w:abstractNum w:abstractNumId="15">
+  <w:abstractNum w:abstractNumId="16">
     <w:nsid w:val="58E17F5F"/>
     <w:multiLevelType w:val="hybridMultilevel"/>
     <w:tmpl w:val="8438F986"/>
@@ -13432,7 +13956,7 @@
       </w:pPr>
     </w:lvl>
   </w:abstractNum>
-  <w:abstractNum w:abstractNumId="16">
+  <w:abstractNum w:abstractNumId="17">
     <w:nsid w:val="5FF4655F"/>
     <w:multiLevelType w:val="hybridMultilevel"/>
     <w:tmpl w:val="591281AE"/>
@@ -13545,7 +14069,93 @@
       </w:rPr>
     </w:lvl>
   </w:abstractNum>
-  <w:abstractNum w:abstractNumId="17">
+  <w:abstractNum w:abstractNumId="18">
+    <w:nsid w:val="6AEA5870"/>
+    <w:multiLevelType w:val="hybridMultilevel"/>
+    <w:tmpl w:val="F39E8F20"/>
+    <w:lvl w:ilvl="0" w:tplc="4009000F">
+      <w:start w:val="1"/>
+      <w:numFmt w:val="decimal"/>
+      <w:lvlText w:val="%1."/>
+      <w:lvlJc w:val="left"/>
+      <w:pPr>
+        <w:ind w:left="1571" w:hanging="360"/>
+      </w:pPr>
+    </w:lvl>
+    <w:lvl w:ilvl="1" w:tplc="40090019" w:tentative="1">
+      <w:start w:val="1"/>
+      <w:numFmt w:val="lowerLetter"/>
+      <w:lvlText w:val="%2."/>
+      <w:lvlJc w:val="left"/>
+      <w:pPr>
+        <w:ind w:left="2291" w:hanging="360"/>
+      </w:pPr>
+    </w:lvl>
+    <w:lvl w:ilvl="2" w:tplc="4009001B" w:tentative="1">
+      <w:start w:val="1"/>
+      <w:numFmt w:val="lowerRoman"/>
+      <w:lvlText w:val="%3."/>
+      <w:lvlJc w:val="right"/>
+      <w:pPr>
+        <w:ind w:left="3011" w:hanging="180"/>
+      </w:pPr>
+    </w:lvl>
+    <w:lvl w:ilvl="3" w:tplc="4009000F" w:tentative="1">
+      <w:start w:val="1"/>
+      <w:numFmt w:val="decimal"/>
+      <w:lvlText w:val="%4."/>
+      <w:lvlJc w:val="left"/>
+      <w:pPr>
+        <w:ind w:left="3731" w:hanging="360"/>
+      </w:pPr>
+    </w:lvl>
+    <w:lvl w:ilvl="4" w:tplc="40090019" w:tentative="1">
+      <w:start w:val="1"/>
+      <w:numFmt w:val="lowerLetter"/>
+      <w:lvlText w:val="%5."/>
+      <w:lvlJc w:val="left"/>
+      <w:pPr>
+        <w:ind w:left="4451" w:hanging="360"/>
+      </w:pPr>
+    </w:lvl>
+    <w:lvl w:ilvl="5" w:tplc="4009001B" w:tentative="1">
+      <w:start w:val="1"/>
+      <w:numFmt w:val="lowerRoman"/>
+      <w:lvlText w:val="%6."/>
+      <w:lvlJc w:val="right"/>
+      <w:pPr>
+        <w:ind w:left="5171" w:hanging="180"/>
+      </w:pPr>
+    </w:lvl>
+    <w:lvl w:ilvl="6" w:tplc="4009000F" w:tentative="1">
+      <w:start w:val="1"/>
+      <w:numFmt w:val="decimal"/>
+      <w:lvlText w:val="%7."/>
+      <w:lvlJc w:val="left"/>
+      <w:pPr>
+        <w:ind w:left="5891" w:hanging="360"/>
+      </w:pPr>
+    </w:lvl>
+    <w:lvl w:ilvl="7" w:tplc="40090019" w:tentative="1">
+      <w:start w:val="1"/>
+      <w:numFmt w:val="lowerLetter"/>
+      <w:lvlText w:val="%8."/>
+      <w:lvlJc w:val="left"/>
+      <w:pPr>
+        <w:ind w:left="6611" w:hanging="360"/>
+      </w:pPr>
+    </w:lvl>
+    <w:lvl w:ilvl="8" w:tplc="4009001B" w:tentative="1">
+      <w:start w:val="1"/>
+      <w:numFmt w:val="lowerRoman"/>
+      <w:lvlText w:val="%9."/>
+      <w:lvlJc w:val="right"/>
+      <w:pPr>
+        <w:ind w:left="7331" w:hanging="180"/>
+      </w:pPr>
+    </w:lvl>
+  </w:abstractNum>
+  <w:abstractNum w:abstractNumId="19">
     <w:nsid w:val="6D261283"/>
     <w:multiLevelType w:val="hybridMultilevel"/>
     <w:tmpl w:val="D3CCD4B4"/>
@@ -13631,7 +14241,7 @@
       </w:pPr>
     </w:lvl>
   </w:abstractNum>
-  <w:abstractNum w:abstractNumId="18">
+  <w:abstractNum w:abstractNumId="20">
     <w:nsid w:val="70EE1788"/>
     <w:multiLevelType w:val="hybridMultilevel"/>
     <w:tmpl w:val="C28AA94A"/>
@@ -13718,13 +14328,13 @@
     </w:lvl>
   </w:abstractNum>
   <w:num w:numId="1">
-    <w:abstractNumId w:val="11"/>
+    <w:abstractNumId w:val="12"/>
   </w:num>
   <w:num w:numId="2">
-    <w:abstractNumId w:val="18"/>
+    <w:abstractNumId w:val="20"/>
   </w:num>
   <w:num w:numId="3">
-    <w:abstractNumId w:val="16"/>
+    <w:abstractNumId w:val="17"/>
   </w:num>
   <w:num w:numId="4">
     <w:abstractNumId w:val="7"/>
@@ -13736,16 +14346,16 @@
     <w:abstractNumId w:val="4"/>
   </w:num>
   <w:num w:numId="7">
-    <w:abstractNumId w:val="13"/>
+    <w:abstractNumId w:val="14"/>
   </w:num>
   <w:num w:numId="8">
-    <w:abstractNumId w:val="10"/>
+    <w:abstractNumId w:val="11"/>
   </w:num>
   <w:num w:numId="9">
     <w:abstractNumId w:val="6"/>
   </w:num>
   <w:num w:numId="10">
-    <w:abstractNumId w:val="12"/>
+    <w:abstractNumId w:val="13"/>
   </w:num>
   <w:num w:numId="11">
     <w:abstractNumId w:val="3"/>
@@ -13754,25 +14364,31 @@
     <w:abstractNumId w:val="2"/>
   </w:num>
   <w:num w:numId="13">
-    <w:abstractNumId w:val="17"/>
+    <w:abstractNumId w:val="19"/>
   </w:num>
   <w:num w:numId="14">
-    <w:abstractNumId w:val="8"/>
+    <w:abstractNumId w:val="9"/>
   </w:num>
   <w:num w:numId="15">
     <w:abstractNumId w:val="1"/>
   </w:num>
   <w:num w:numId="16">
-    <w:abstractNumId w:val="14"/>
+    <w:abstractNumId w:val="15"/>
   </w:num>
   <w:num w:numId="17">
     <w:abstractNumId w:val="0"/>
   </w:num>
   <w:num w:numId="18">
-    <w:abstractNumId w:val="9"/>
+    <w:abstractNumId w:val="10"/>
   </w:num>
   <w:num w:numId="19">
-    <w:abstractNumId w:val="15"/>
+    <w:abstractNumId w:val="16"/>
+  </w:num>
+  <w:num w:numId="20">
+    <w:abstractNumId w:val="8"/>
+  </w:num>
+  <w:num w:numId="21">
+    <w:abstractNumId w:val="18"/>
   </w:num>
 </w:numbering>
 </file>

</xml_diff>

<commit_message>
Update project change log
Co-authored-by: Copilot <223556219+Copilot@users.noreply.github.com>
</commit_message>
<xml_diff>
--- a/Fourstep file change after new plan so fille name and new file name.docx
+++ b/Fourstep file change after new plan so fille name and new file name.docx
@@ -11991,8 +11991,10 @@
           <w:szCs w:val="32"/>
           <w:lang w:val="en-US"/>
         </w:rPr>
-        <w:t xml:space="preserve">Today File </w:t>
-      </w:r>
+        <w:t>Today File Change (21/1</w:t>
+      </w:r>
+      <w:bookmarkStart w:id="0" w:name="_GoBack"/>
+      <w:bookmarkEnd w:id="0"/>
       <w:r>
         <w:rPr>
           <w:rFonts w:ascii="Times New Roman" w:hAnsi="Times New Roman" w:cs="Times New Roman"/>
@@ -12002,7 +12004,7 @@
           <w:szCs w:val="32"/>
           <w:lang w:val="en-US"/>
         </w:rPr>
-        <w:t>Change (21</w:t>
+        <w:t>0</w:t>
       </w:r>
       <w:r>
         <w:rPr>
@@ -12013,7 +12015,7 @@
           <w:szCs w:val="32"/>
           <w:lang w:val="en-US"/>
         </w:rPr>
-        <w:t>/09)</w:t>
+        <w:t>)</w:t>
       </w:r>
     </w:p>
     <w:p>
@@ -12352,10 +12354,134 @@
           <w:szCs w:val="24"/>
           <w:lang w:val="en-US"/>
         </w:rPr>
-        <w:t>frontend\src\modules\shoppee\pages\BVProductList.jsx</w:t>
-      </w:r>
-      <w:bookmarkStart w:id="0" w:name="_GoBack"/>
-      <w:bookmarkEnd w:id="0"/>
+        <w:t>frontend\</w:t>
+      </w:r>
+      <w:proofErr w:type="spellStart"/>
+      <w:r>
+        <w:rPr>
+          <w:rFonts w:ascii="Times New Roman" w:hAnsi="Times New Roman" w:cs="Times New Roman"/>
+          <w:b/>
+          <w:color w:val="000000" w:themeColor="text1"/>
+          <w:sz w:val="24"/>
+          <w:szCs w:val="24"/>
+          <w:lang w:val="en-US"/>
+        </w:rPr>
+        <w:t>src</w:t>
+      </w:r>
+      <w:proofErr w:type="spellEnd"/>
+      <w:r>
+        <w:rPr>
+          <w:rFonts w:ascii="Times New Roman" w:hAnsi="Times New Roman" w:cs="Times New Roman"/>
+          <w:b/>
+          <w:color w:val="000000" w:themeColor="text1"/>
+          <w:sz w:val="24"/>
+          <w:szCs w:val="24"/>
+          <w:lang w:val="en-US"/>
+        </w:rPr>
+        <w:t>\modules\</w:t>
+      </w:r>
+      <w:proofErr w:type="spellStart"/>
+      <w:r>
+        <w:rPr>
+          <w:rFonts w:ascii="Times New Roman" w:hAnsi="Times New Roman" w:cs="Times New Roman"/>
+          <w:b/>
+          <w:color w:val="000000" w:themeColor="text1"/>
+          <w:sz w:val="24"/>
+          <w:szCs w:val="24"/>
+          <w:lang w:val="en-US"/>
+        </w:rPr>
+        <w:t>shoppee</w:t>
+      </w:r>
+      <w:proofErr w:type="spellEnd"/>
+      <w:r>
+        <w:rPr>
+          <w:rFonts w:ascii="Times New Roman" w:hAnsi="Times New Roman" w:cs="Times New Roman"/>
+          <w:b/>
+          <w:color w:val="000000" w:themeColor="text1"/>
+          <w:sz w:val="24"/>
+          <w:szCs w:val="24"/>
+          <w:lang w:val="en-US"/>
+        </w:rPr>
+        <w:t>\pages\</w:t>
+      </w:r>
+      <w:proofErr w:type="spellStart"/>
+      <w:r>
+        <w:rPr>
+          <w:rFonts w:ascii="Times New Roman" w:hAnsi="Times New Roman" w:cs="Times New Roman"/>
+          <w:b/>
+          <w:color w:val="000000" w:themeColor="text1"/>
+          <w:sz w:val="24"/>
+          <w:szCs w:val="24"/>
+          <w:lang w:val="en-US"/>
+        </w:rPr>
+        <w:t>BVProductList.jsx</w:t>
+      </w:r>
+      <w:proofErr w:type="spellEnd"/>
+    </w:p>
+    <w:p>
+      <w:pPr>
+        <w:pStyle w:val="ListParagraph"/>
+        <w:ind w:left="1571"/>
+        <w:rPr>
+          <w:rFonts w:ascii="Times New Roman" w:hAnsi="Times New Roman" w:cs="Times New Roman"/>
+          <w:b/>
+          <w:color w:val="000000" w:themeColor="text1"/>
+          <w:sz w:val="24"/>
+          <w:szCs w:val="24"/>
+          <w:lang w:val="en-US"/>
+        </w:rPr>
+      </w:pPr>
+    </w:p>
+    <w:p>
+      <w:pPr>
+        <w:pStyle w:val="ListParagraph"/>
+        <w:ind w:left="1440"/>
+        <w:jc w:val="center"/>
+        <w:rPr>
+          <w:rFonts w:ascii="Times New Roman" w:hAnsi="Times New Roman" w:cs="Times New Roman"/>
+          <w:b/>
+          <w:color w:val="000000" w:themeColor="text1"/>
+          <w:sz w:val="32"/>
+          <w:szCs w:val="32"/>
+          <w:lang w:val="en-US"/>
+        </w:rPr>
+      </w:pPr>
+      <w:r>
+        <w:rPr>
+          <w:rFonts w:ascii="Times New Roman" w:hAnsi="Times New Roman" w:cs="Times New Roman"/>
+          <w:b/>
+          <w:color w:val="000000" w:themeColor="text1"/>
+          <w:sz w:val="32"/>
+          <w:szCs w:val="32"/>
+          <w:lang w:val="en-US"/>
+        </w:rPr>
+        <w:t>Today File Change (26/10</w:t>
+      </w:r>
+      <w:r>
+        <w:rPr>
+          <w:rFonts w:ascii="Times New Roman" w:hAnsi="Times New Roman" w:cs="Times New Roman"/>
+          <w:b/>
+          <w:color w:val="000000" w:themeColor="text1"/>
+          <w:sz w:val="32"/>
+          <w:szCs w:val="32"/>
+          <w:lang w:val="en-US"/>
+        </w:rPr>
+        <w:t>)</w:t>
+      </w:r>
+    </w:p>
+    <w:p>
+      <w:pPr>
+        <w:pStyle w:val="ListParagraph"/>
+        <w:ind w:left="1571"/>
+        <w:rPr>
+          <w:rFonts w:ascii="Times New Roman" w:hAnsi="Times New Roman" w:cs="Times New Roman"/>
+          <w:b/>
+          <w:color w:val="000000" w:themeColor="text1"/>
+          <w:sz w:val="24"/>
+          <w:szCs w:val="24"/>
+          <w:lang w:val="en-US"/>
+        </w:rPr>
+      </w:pPr>
     </w:p>
     <w:p>
       <w:pPr>

</xml_diff>